<commit_message>
Residual tumor RX를 결측으로 처리 (cfg$analysis_na_values)
RX(평가 불가)는 Table 1 검정과 비율에서 제외하고 Missing으로 집계.
01 → 02b → 03 재실행; 생존 n/사건 수는 변화 없음.

Co-Authored-By: Claude Opus 5.5 <noreply@anthropic.com>
</commit_message>
<xml_diff>
--- a/output/tables/COAD/COAD_table1_APC.docx
+++ b/output/tables/COAD/COAD_table1_APC.docx
@@ -12703,7 +12703,7 @@
                 <w:szCs w:val="18"/>
                 <w:color w:val="000000"/>
               </w:rPr>
-              <w:t xml:space="preserve">0.403</w:t>
+              <w:t xml:space="preserve">0.277</w:t>
             </w:r>
           </w:p>
         </w:tc>
@@ -12818,117 +12818,117 @@
                 <w:szCs w:val="18"/>
                 <w:color w:val="000000"/>
               </w:rPr>
-              <w:t xml:space="preserve">318 (86.9%)</w:t>
-            </w:r>
-          </w:p>
-        </w:tc>
-        <w:tc>
-          <w:tcPr>
-            <w:tcBorders>
-              <w:bottom w:val="none" w:sz="0" w:space="0" w:color="000000"/>
-              <w:top w:val="none" w:sz="0" w:space="0" w:color="000000"/>
-              <w:left w:val="none" w:sz="0" w:space="0" w:color="000000"/>
-              <w:right w:val="none" w:sz="0" w:space="0" w:color="000000"/>
-            </w:tcBorders>
-            <w:shd w:val="clear" w:color="auto" w:fill="FFFFFF"/>
-            <w:tcMar>
-              <w:top w:w="0" w:type="dxa"/>
-              <w:bottom w:w="0" w:type="dxa"/>
-              <w:left w:w="0" w:type="dxa"/>
-              <w:right w:w="0" w:type="dxa"/>
-            </w:tcMar>
-            <w:vAlign w:val="top"/>
-          </w:tcPr>
-          <w:p>
-            <w:pPr>
-              <w:pStyle w:val="Normal"/>
-              <w:jc w:val="center"/>
-              <w:pBdr>
-                <w:bottom w:val="none" w:sz="0" w:space="0" w:color="000000"/>
-                <w:top w:val="none" w:sz="0" w:space="0" w:color="000000"/>
-                <w:left w:val="none" w:sz="0" w:space="0" w:color="000000"/>
-                <w:right w:val="none" w:sz="0" w:space="0" w:color="000000"/>
-              </w:pBdr>
-              <w:spacing w:after="100" w:before="100" w:line="240"/>
-              <w:ind w:left="100" w:right="100" w:firstLine="0" w:firstLineChars="0"/>
-              <w:rPr>
-                <w:rFonts w:ascii="Times New Roman" w:hAnsi="Times New Roman" w:eastAsia="Times New Roman" w:cs="Times New Roman"/>
-                <w:i w:val="false"/>
-                <w:b w:val="false"/>
-                <w:u w:val="none"/>
-                <w:strike w:val="false"/>
-                <w:sz w:val="18"/>
-                <w:szCs w:val="18"/>
-                <w:color w:val="000000"/>
-              </w:rPr>
-            </w:pPr>
-            <w:r>
-              <w:rPr>
-                <w:rFonts w:ascii="Times New Roman" w:hAnsi="Times New Roman" w:eastAsia="Times New Roman" w:cs="Times New Roman"/>
-                <w:i w:val="false"/>
-                <w:b w:val="false"/>
-                <w:u w:val="none"/>
-                <w:strike w:val="false"/>
-                <w:sz w:val="18"/>
-                <w:szCs w:val="18"/>
-                <w:color w:val="000000"/>
-              </w:rPr>
-              <w:t xml:space="preserve">157 (85.8%)</w:t>
-            </w:r>
-          </w:p>
-        </w:tc>
-        <w:tc>
-          <w:tcPr>
-            <w:tcBorders>
-              <w:bottom w:val="none" w:sz="0" w:space="0" w:color="000000"/>
-              <w:top w:val="none" w:sz="0" w:space="0" w:color="000000"/>
-              <w:left w:val="none" w:sz="0" w:space="0" w:color="000000"/>
-              <w:right w:val="none" w:sz="0" w:space="0" w:color="000000"/>
-            </w:tcBorders>
-            <w:shd w:val="clear" w:color="auto" w:fill="FFFFFF"/>
-            <w:tcMar>
-              <w:top w:w="0" w:type="dxa"/>
-              <w:bottom w:w="0" w:type="dxa"/>
-              <w:left w:w="0" w:type="dxa"/>
-              <w:right w:w="0" w:type="dxa"/>
-            </w:tcMar>
-            <w:vAlign w:val="top"/>
-          </w:tcPr>
-          <w:p>
-            <w:pPr>
-              <w:pStyle w:val="Normal"/>
-              <w:jc w:val="center"/>
-              <w:pBdr>
-                <w:bottom w:val="none" w:sz="0" w:space="0" w:color="000000"/>
-                <w:top w:val="none" w:sz="0" w:space="0" w:color="000000"/>
-                <w:left w:val="none" w:sz="0" w:space="0" w:color="000000"/>
-                <w:right w:val="none" w:sz="0" w:space="0" w:color="000000"/>
-              </w:pBdr>
-              <w:spacing w:after="100" w:before="100" w:line="240"/>
-              <w:ind w:left="100" w:right="100" w:firstLine="0" w:firstLineChars="0"/>
-              <w:rPr>
-                <w:rFonts w:ascii="Times New Roman" w:hAnsi="Times New Roman" w:eastAsia="Times New Roman" w:cs="Times New Roman"/>
-                <w:i w:val="false"/>
-                <w:b w:val="false"/>
-                <w:u w:val="none"/>
-                <w:strike w:val="false"/>
-                <w:sz w:val="18"/>
-                <w:szCs w:val="18"/>
-                <w:color w:val="000000"/>
-              </w:rPr>
-            </w:pPr>
-            <w:r>
-              <w:rPr>
-                <w:rFonts w:ascii="Times New Roman" w:hAnsi="Times New Roman" w:eastAsia="Times New Roman" w:cs="Times New Roman"/>
-                <w:i w:val="false"/>
-                <w:b w:val="false"/>
-                <w:u w:val="none"/>
-                <w:strike w:val="false"/>
-                <w:sz w:val="18"/>
-                <w:szCs w:val="18"/>
-                <w:color w:val="000000"/>
-              </w:rPr>
-              <w:t xml:space="preserve">161 (88.0%)</w:t>
+              <w:t xml:space="preserve">318 (92.7%)</w:t>
+            </w:r>
+          </w:p>
+        </w:tc>
+        <w:tc>
+          <w:tcPr>
+            <w:tcBorders>
+              <w:bottom w:val="none" w:sz="0" w:space="0" w:color="000000"/>
+              <w:top w:val="none" w:sz="0" w:space="0" w:color="000000"/>
+              <w:left w:val="none" w:sz="0" w:space="0" w:color="000000"/>
+              <w:right w:val="none" w:sz="0" w:space="0" w:color="000000"/>
+            </w:tcBorders>
+            <w:shd w:val="clear" w:color="auto" w:fill="FFFFFF"/>
+            <w:tcMar>
+              <w:top w:w="0" w:type="dxa"/>
+              <w:bottom w:w="0" w:type="dxa"/>
+              <w:left w:w="0" w:type="dxa"/>
+              <w:right w:w="0" w:type="dxa"/>
+            </w:tcMar>
+            <w:vAlign w:val="top"/>
+          </w:tcPr>
+          <w:p>
+            <w:pPr>
+              <w:pStyle w:val="Normal"/>
+              <w:jc w:val="center"/>
+              <w:pBdr>
+                <w:bottom w:val="none" w:sz="0" w:space="0" w:color="000000"/>
+                <w:top w:val="none" w:sz="0" w:space="0" w:color="000000"/>
+                <w:left w:val="none" w:sz="0" w:space="0" w:color="000000"/>
+                <w:right w:val="none" w:sz="0" w:space="0" w:color="000000"/>
+              </w:pBdr>
+              <w:spacing w:after="100" w:before="100" w:line="240"/>
+              <w:ind w:left="100" w:right="100" w:firstLine="0" w:firstLineChars="0"/>
+              <w:rPr>
+                <w:rFonts w:ascii="Times New Roman" w:hAnsi="Times New Roman" w:eastAsia="Times New Roman" w:cs="Times New Roman"/>
+                <w:i w:val="false"/>
+                <w:b w:val="false"/>
+                <w:u w:val="none"/>
+                <w:strike w:val="false"/>
+                <w:sz w:val="18"/>
+                <w:szCs w:val="18"/>
+                <w:color w:val="000000"/>
+              </w:rPr>
+            </w:pPr>
+            <w:r>
+              <w:rPr>
+                <w:rFonts w:ascii="Times New Roman" w:hAnsi="Times New Roman" w:eastAsia="Times New Roman" w:cs="Times New Roman"/>
+                <w:i w:val="false"/>
+                <w:b w:val="false"/>
+                <w:u w:val="none"/>
+                <w:strike w:val="false"/>
+                <w:sz w:val="18"/>
+                <w:szCs w:val="18"/>
+                <w:color w:val="000000"/>
+              </w:rPr>
+              <w:t xml:space="preserve">157 (90.8%)</w:t>
+            </w:r>
+          </w:p>
+        </w:tc>
+        <w:tc>
+          <w:tcPr>
+            <w:tcBorders>
+              <w:bottom w:val="none" w:sz="0" w:space="0" w:color="000000"/>
+              <w:top w:val="none" w:sz="0" w:space="0" w:color="000000"/>
+              <w:left w:val="none" w:sz="0" w:space="0" w:color="000000"/>
+              <w:right w:val="none" w:sz="0" w:space="0" w:color="000000"/>
+            </w:tcBorders>
+            <w:shd w:val="clear" w:color="auto" w:fill="FFFFFF"/>
+            <w:tcMar>
+              <w:top w:w="0" w:type="dxa"/>
+              <w:bottom w:w="0" w:type="dxa"/>
+              <w:left w:w="0" w:type="dxa"/>
+              <w:right w:w="0" w:type="dxa"/>
+            </w:tcMar>
+            <w:vAlign w:val="top"/>
+          </w:tcPr>
+          <w:p>
+            <w:pPr>
+              <w:pStyle w:val="Normal"/>
+              <w:jc w:val="center"/>
+              <w:pBdr>
+                <w:bottom w:val="none" w:sz="0" w:space="0" w:color="000000"/>
+                <w:top w:val="none" w:sz="0" w:space="0" w:color="000000"/>
+                <w:left w:val="none" w:sz="0" w:space="0" w:color="000000"/>
+                <w:right w:val="none" w:sz="0" w:space="0" w:color="000000"/>
+              </w:pBdr>
+              <w:spacing w:after="100" w:before="100" w:line="240"/>
+              <w:ind w:left="100" w:right="100" w:firstLine="0" w:firstLineChars="0"/>
+              <w:rPr>
+                <w:rFonts w:ascii="Times New Roman" w:hAnsi="Times New Roman" w:eastAsia="Times New Roman" w:cs="Times New Roman"/>
+                <w:i w:val="false"/>
+                <w:b w:val="false"/>
+                <w:u w:val="none"/>
+                <w:strike w:val="false"/>
+                <w:sz w:val="18"/>
+                <w:szCs w:val="18"/>
+                <w:color w:val="000000"/>
+              </w:rPr>
+            </w:pPr>
+            <w:r>
+              <w:rPr>
+                <w:rFonts w:ascii="Times New Roman" w:hAnsi="Times New Roman" w:eastAsia="Times New Roman" w:cs="Times New Roman"/>
+                <w:i w:val="false"/>
+                <w:b w:val="false"/>
+                <w:u w:val="none"/>
+                <w:strike w:val="false"/>
+                <w:sz w:val="18"/>
+                <w:szCs w:val="18"/>
+                <w:color w:val="000000"/>
+              </w:rPr>
+              <w:t xml:space="preserve">161 (94.7%)</w:t>
             </w:r>
           </w:p>
         </w:tc>
@@ -13098,117 +13098,117 @@
                 <w:szCs w:val="18"/>
                 <w:color w:val="000000"/>
               </w:rPr>
-              <w:t xml:space="preserve">4 (1.1%)</w:t>
-            </w:r>
-          </w:p>
-        </w:tc>
-        <w:tc>
-          <w:tcPr>
-            <w:tcBorders>
-              <w:bottom w:val="none" w:sz="0" w:space="0" w:color="000000"/>
-              <w:top w:val="none" w:sz="0" w:space="0" w:color="000000"/>
-              <w:left w:val="none" w:sz="0" w:space="0" w:color="000000"/>
-              <w:right w:val="none" w:sz="0" w:space="0" w:color="000000"/>
-            </w:tcBorders>
-            <w:shd w:val="clear" w:color="auto" w:fill="FFFFFF"/>
-            <w:tcMar>
-              <w:top w:w="0" w:type="dxa"/>
-              <w:bottom w:w="0" w:type="dxa"/>
-              <w:left w:w="0" w:type="dxa"/>
-              <w:right w:w="0" w:type="dxa"/>
-            </w:tcMar>
-            <w:vAlign w:val="top"/>
-          </w:tcPr>
-          <w:p>
-            <w:pPr>
-              <w:pStyle w:val="Normal"/>
-              <w:jc w:val="center"/>
-              <w:pBdr>
-                <w:bottom w:val="none" w:sz="0" w:space="0" w:color="000000"/>
-                <w:top w:val="none" w:sz="0" w:space="0" w:color="000000"/>
-                <w:left w:val="none" w:sz="0" w:space="0" w:color="000000"/>
-                <w:right w:val="none" w:sz="0" w:space="0" w:color="000000"/>
-              </w:pBdr>
-              <w:spacing w:after="100" w:before="100" w:line="240"/>
-              <w:ind w:left="100" w:right="100" w:firstLine="0" w:firstLineChars="0"/>
-              <w:rPr>
-                <w:rFonts w:ascii="Times New Roman" w:hAnsi="Times New Roman" w:eastAsia="Times New Roman" w:cs="Times New Roman"/>
-                <w:i w:val="false"/>
-                <w:b w:val="false"/>
-                <w:u w:val="none"/>
-                <w:strike w:val="false"/>
-                <w:sz w:val="18"/>
-                <w:szCs w:val="18"/>
-                <w:color w:val="000000"/>
-              </w:rPr>
-            </w:pPr>
-            <w:r>
-              <w:rPr>
-                <w:rFonts w:ascii="Times New Roman" w:hAnsi="Times New Roman" w:eastAsia="Times New Roman" w:cs="Times New Roman"/>
-                <w:i w:val="false"/>
-                <w:b w:val="false"/>
-                <w:u w:val="none"/>
-                <w:strike w:val="false"/>
-                <w:sz w:val="18"/>
-                <w:szCs w:val="18"/>
-                <w:color w:val="000000"/>
-              </w:rPr>
-              <w:t xml:space="preserve">2 (1.1%)</w:t>
-            </w:r>
-          </w:p>
-        </w:tc>
-        <w:tc>
-          <w:tcPr>
-            <w:tcBorders>
-              <w:bottom w:val="none" w:sz="0" w:space="0" w:color="000000"/>
-              <w:top w:val="none" w:sz="0" w:space="0" w:color="000000"/>
-              <w:left w:val="none" w:sz="0" w:space="0" w:color="000000"/>
-              <w:right w:val="none" w:sz="0" w:space="0" w:color="000000"/>
-            </w:tcBorders>
-            <w:shd w:val="clear" w:color="auto" w:fill="FFFFFF"/>
-            <w:tcMar>
-              <w:top w:w="0" w:type="dxa"/>
-              <w:bottom w:w="0" w:type="dxa"/>
-              <w:left w:w="0" w:type="dxa"/>
-              <w:right w:w="0" w:type="dxa"/>
-            </w:tcMar>
-            <w:vAlign w:val="top"/>
-          </w:tcPr>
-          <w:p>
-            <w:pPr>
-              <w:pStyle w:val="Normal"/>
-              <w:jc w:val="center"/>
-              <w:pBdr>
-                <w:bottom w:val="none" w:sz="0" w:space="0" w:color="000000"/>
-                <w:top w:val="none" w:sz="0" w:space="0" w:color="000000"/>
-                <w:left w:val="none" w:sz="0" w:space="0" w:color="000000"/>
-                <w:right w:val="none" w:sz="0" w:space="0" w:color="000000"/>
-              </w:pBdr>
-              <w:spacing w:after="100" w:before="100" w:line="240"/>
-              <w:ind w:left="100" w:right="100" w:firstLine="0" w:firstLineChars="0"/>
-              <w:rPr>
-                <w:rFonts w:ascii="Times New Roman" w:hAnsi="Times New Roman" w:eastAsia="Times New Roman" w:cs="Times New Roman"/>
-                <w:i w:val="false"/>
-                <w:b w:val="false"/>
-                <w:u w:val="none"/>
-                <w:strike w:val="false"/>
-                <w:sz w:val="18"/>
-                <w:szCs w:val="18"/>
-                <w:color w:val="000000"/>
-              </w:rPr>
-            </w:pPr>
-            <w:r>
-              <w:rPr>
-                <w:rFonts w:ascii="Times New Roman" w:hAnsi="Times New Roman" w:eastAsia="Times New Roman" w:cs="Times New Roman"/>
-                <w:i w:val="false"/>
-                <w:b w:val="false"/>
-                <w:u w:val="none"/>
-                <w:strike w:val="false"/>
-                <w:sz w:val="18"/>
-                <w:szCs w:val="18"/>
-                <w:color w:val="000000"/>
-              </w:rPr>
-              <w:t xml:space="preserve">2 (1.1%)</w:t>
+              <w:t xml:space="preserve">4 (1.2%)</w:t>
+            </w:r>
+          </w:p>
+        </w:tc>
+        <w:tc>
+          <w:tcPr>
+            <w:tcBorders>
+              <w:bottom w:val="none" w:sz="0" w:space="0" w:color="000000"/>
+              <w:top w:val="none" w:sz="0" w:space="0" w:color="000000"/>
+              <w:left w:val="none" w:sz="0" w:space="0" w:color="000000"/>
+              <w:right w:val="none" w:sz="0" w:space="0" w:color="000000"/>
+            </w:tcBorders>
+            <w:shd w:val="clear" w:color="auto" w:fill="FFFFFF"/>
+            <w:tcMar>
+              <w:top w:w="0" w:type="dxa"/>
+              <w:bottom w:w="0" w:type="dxa"/>
+              <w:left w:w="0" w:type="dxa"/>
+              <w:right w:w="0" w:type="dxa"/>
+            </w:tcMar>
+            <w:vAlign w:val="top"/>
+          </w:tcPr>
+          <w:p>
+            <w:pPr>
+              <w:pStyle w:val="Normal"/>
+              <w:jc w:val="center"/>
+              <w:pBdr>
+                <w:bottom w:val="none" w:sz="0" w:space="0" w:color="000000"/>
+                <w:top w:val="none" w:sz="0" w:space="0" w:color="000000"/>
+                <w:left w:val="none" w:sz="0" w:space="0" w:color="000000"/>
+                <w:right w:val="none" w:sz="0" w:space="0" w:color="000000"/>
+              </w:pBdr>
+              <w:spacing w:after="100" w:before="100" w:line="240"/>
+              <w:ind w:left="100" w:right="100" w:firstLine="0" w:firstLineChars="0"/>
+              <w:rPr>
+                <w:rFonts w:ascii="Times New Roman" w:hAnsi="Times New Roman" w:eastAsia="Times New Roman" w:cs="Times New Roman"/>
+                <w:i w:val="false"/>
+                <w:b w:val="false"/>
+                <w:u w:val="none"/>
+                <w:strike w:val="false"/>
+                <w:sz w:val="18"/>
+                <w:szCs w:val="18"/>
+                <w:color w:val="000000"/>
+              </w:rPr>
+            </w:pPr>
+            <w:r>
+              <w:rPr>
+                <w:rFonts w:ascii="Times New Roman" w:hAnsi="Times New Roman" w:eastAsia="Times New Roman" w:cs="Times New Roman"/>
+                <w:i w:val="false"/>
+                <w:b w:val="false"/>
+                <w:u w:val="none"/>
+                <w:strike w:val="false"/>
+                <w:sz w:val="18"/>
+                <w:szCs w:val="18"/>
+                <w:color w:val="000000"/>
+              </w:rPr>
+              <w:t xml:space="preserve">2 (1.2%)</w:t>
+            </w:r>
+          </w:p>
+        </w:tc>
+        <w:tc>
+          <w:tcPr>
+            <w:tcBorders>
+              <w:bottom w:val="none" w:sz="0" w:space="0" w:color="000000"/>
+              <w:top w:val="none" w:sz="0" w:space="0" w:color="000000"/>
+              <w:left w:val="none" w:sz="0" w:space="0" w:color="000000"/>
+              <w:right w:val="none" w:sz="0" w:space="0" w:color="000000"/>
+            </w:tcBorders>
+            <w:shd w:val="clear" w:color="auto" w:fill="FFFFFF"/>
+            <w:tcMar>
+              <w:top w:w="0" w:type="dxa"/>
+              <w:bottom w:w="0" w:type="dxa"/>
+              <w:left w:w="0" w:type="dxa"/>
+              <w:right w:w="0" w:type="dxa"/>
+            </w:tcMar>
+            <w:vAlign w:val="top"/>
+          </w:tcPr>
+          <w:p>
+            <w:pPr>
+              <w:pStyle w:val="Normal"/>
+              <w:jc w:val="center"/>
+              <w:pBdr>
+                <w:bottom w:val="none" w:sz="0" w:space="0" w:color="000000"/>
+                <w:top w:val="none" w:sz="0" w:space="0" w:color="000000"/>
+                <w:left w:val="none" w:sz="0" w:space="0" w:color="000000"/>
+                <w:right w:val="none" w:sz="0" w:space="0" w:color="000000"/>
+              </w:pBdr>
+              <w:spacing w:after="100" w:before="100" w:line="240"/>
+              <w:ind w:left="100" w:right="100" w:firstLine="0" w:firstLineChars="0"/>
+              <w:rPr>
+                <w:rFonts w:ascii="Times New Roman" w:hAnsi="Times New Roman" w:eastAsia="Times New Roman" w:cs="Times New Roman"/>
+                <w:i w:val="false"/>
+                <w:b w:val="false"/>
+                <w:u w:val="none"/>
+                <w:strike w:val="false"/>
+                <w:sz w:val="18"/>
+                <w:szCs w:val="18"/>
+                <w:color w:val="000000"/>
+              </w:rPr>
+            </w:pPr>
+            <w:r>
+              <w:rPr>
+                <w:rFonts w:ascii="Times New Roman" w:hAnsi="Times New Roman" w:eastAsia="Times New Roman" w:cs="Times New Roman"/>
+                <w:i w:val="false"/>
+                <w:b w:val="false"/>
+                <w:u w:val="none"/>
+                <w:strike w:val="false"/>
+                <w:sz w:val="18"/>
+                <w:szCs w:val="18"/>
+                <w:color w:val="000000"/>
+              </w:rPr>
+              <w:t xml:space="preserve">2 (1.2%)</w:t>
             </w:r>
           </w:p>
         </w:tc>
@@ -13378,117 +13378,117 @@
                 <w:szCs w:val="18"/>
                 <w:color w:val="000000"/>
               </w:rPr>
-              <w:t xml:space="preserve">21 (5.7%)</w:t>
-            </w:r>
-          </w:p>
-        </w:tc>
-        <w:tc>
-          <w:tcPr>
-            <w:tcBorders>
-              <w:bottom w:val="none" w:sz="0" w:space="0" w:color="000000"/>
-              <w:top w:val="none" w:sz="0" w:space="0" w:color="000000"/>
-              <w:left w:val="none" w:sz="0" w:space="0" w:color="000000"/>
-              <w:right w:val="none" w:sz="0" w:space="0" w:color="000000"/>
-            </w:tcBorders>
-            <w:shd w:val="clear" w:color="auto" w:fill="FFFFFF"/>
-            <w:tcMar>
-              <w:top w:w="0" w:type="dxa"/>
-              <w:bottom w:w="0" w:type="dxa"/>
-              <w:left w:w="0" w:type="dxa"/>
-              <w:right w:w="0" w:type="dxa"/>
-            </w:tcMar>
-            <w:vAlign w:val="top"/>
-          </w:tcPr>
-          <w:p>
-            <w:pPr>
-              <w:pStyle w:val="Normal"/>
-              <w:jc w:val="center"/>
-              <w:pBdr>
-                <w:bottom w:val="none" w:sz="0" w:space="0" w:color="000000"/>
-                <w:top w:val="none" w:sz="0" w:space="0" w:color="000000"/>
-                <w:left w:val="none" w:sz="0" w:space="0" w:color="000000"/>
-                <w:right w:val="none" w:sz="0" w:space="0" w:color="000000"/>
-              </w:pBdr>
-              <w:spacing w:after="100" w:before="100" w:line="240"/>
-              <w:ind w:left="100" w:right="100" w:firstLine="0" w:firstLineChars="0"/>
-              <w:rPr>
-                <w:rFonts w:ascii="Times New Roman" w:hAnsi="Times New Roman" w:eastAsia="Times New Roman" w:cs="Times New Roman"/>
-                <w:i w:val="false"/>
-                <w:b w:val="false"/>
-                <w:u w:val="none"/>
-                <w:strike w:val="false"/>
-                <w:sz w:val="18"/>
-                <w:szCs w:val="18"/>
-                <w:color w:val="000000"/>
-              </w:rPr>
-            </w:pPr>
-            <w:r>
-              <w:rPr>
-                <w:rFonts w:ascii="Times New Roman" w:hAnsi="Times New Roman" w:eastAsia="Times New Roman" w:cs="Times New Roman"/>
-                <w:i w:val="false"/>
-                <w:b w:val="false"/>
-                <w:u w:val="none"/>
-                <w:strike w:val="false"/>
-                <w:sz w:val="18"/>
-                <w:szCs w:val="18"/>
-                <w:color w:val="000000"/>
-              </w:rPr>
-              <w:t xml:space="preserve">14 (7.7%)</w:t>
-            </w:r>
-          </w:p>
-        </w:tc>
-        <w:tc>
-          <w:tcPr>
-            <w:tcBorders>
-              <w:bottom w:val="none" w:sz="0" w:space="0" w:color="000000"/>
-              <w:top w:val="none" w:sz="0" w:space="0" w:color="000000"/>
-              <w:left w:val="none" w:sz="0" w:space="0" w:color="000000"/>
-              <w:right w:val="none" w:sz="0" w:space="0" w:color="000000"/>
-            </w:tcBorders>
-            <w:shd w:val="clear" w:color="auto" w:fill="FFFFFF"/>
-            <w:tcMar>
-              <w:top w:w="0" w:type="dxa"/>
-              <w:bottom w:w="0" w:type="dxa"/>
-              <w:left w:w="0" w:type="dxa"/>
-              <w:right w:w="0" w:type="dxa"/>
-            </w:tcMar>
-            <w:vAlign w:val="top"/>
-          </w:tcPr>
-          <w:p>
-            <w:pPr>
-              <w:pStyle w:val="Normal"/>
-              <w:jc w:val="center"/>
-              <w:pBdr>
-                <w:bottom w:val="none" w:sz="0" w:space="0" w:color="000000"/>
-                <w:top w:val="none" w:sz="0" w:space="0" w:color="000000"/>
-                <w:left w:val="none" w:sz="0" w:space="0" w:color="000000"/>
-                <w:right w:val="none" w:sz="0" w:space="0" w:color="000000"/>
-              </w:pBdr>
-              <w:spacing w:after="100" w:before="100" w:line="240"/>
-              <w:ind w:left="100" w:right="100" w:firstLine="0" w:firstLineChars="0"/>
-              <w:rPr>
-                <w:rFonts w:ascii="Times New Roman" w:hAnsi="Times New Roman" w:eastAsia="Times New Roman" w:cs="Times New Roman"/>
-                <w:i w:val="false"/>
-                <w:b w:val="false"/>
-                <w:u w:val="none"/>
-                <w:strike w:val="false"/>
-                <w:sz w:val="18"/>
-                <w:szCs w:val="18"/>
-                <w:color w:val="000000"/>
-              </w:rPr>
-            </w:pPr>
-            <w:r>
-              <w:rPr>
-                <w:rFonts w:ascii="Times New Roman" w:hAnsi="Times New Roman" w:eastAsia="Times New Roman" w:cs="Times New Roman"/>
-                <w:i w:val="false"/>
-                <w:b w:val="false"/>
-                <w:u w:val="none"/>
-                <w:strike w:val="false"/>
-                <w:sz w:val="18"/>
-                <w:szCs w:val="18"/>
-                <w:color w:val="000000"/>
-              </w:rPr>
-              <w:t xml:space="preserve">7 (3.8%)</w:t>
+              <w:t xml:space="preserve">21 (6.1%)</w:t>
+            </w:r>
+          </w:p>
+        </w:tc>
+        <w:tc>
+          <w:tcPr>
+            <w:tcBorders>
+              <w:bottom w:val="none" w:sz="0" w:space="0" w:color="000000"/>
+              <w:top w:val="none" w:sz="0" w:space="0" w:color="000000"/>
+              <w:left w:val="none" w:sz="0" w:space="0" w:color="000000"/>
+              <w:right w:val="none" w:sz="0" w:space="0" w:color="000000"/>
+            </w:tcBorders>
+            <w:shd w:val="clear" w:color="auto" w:fill="FFFFFF"/>
+            <w:tcMar>
+              <w:top w:w="0" w:type="dxa"/>
+              <w:bottom w:w="0" w:type="dxa"/>
+              <w:left w:w="0" w:type="dxa"/>
+              <w:right w:w="0" w:type="dxa"/>
+            </w:tcMar>
+            <w:vAlign w:val="top"/>
+          </w:tcPr>
+          <w:p>
+            <w:pPr>
+              <w:pStyle w:val="Normal"/>
+              <w:jc w:val="center"/>
+              <w:pBdr>
+                <w:bottom w:val="none" w:sz="0" w:space="0" w:color="000000"/>
+                <w:top w:val="none" w:sz="0" w:space="0" w:color="000000"/>
+                <w:left w:val="none" w:sz="0" w:space="0" w:color="000000"/>
+                <w:right w:val="none" w:sz="0" w:space="0" w:color="000000"/>
+              </w:pBdr>
+              <w:spacing w:after="100" w:before="100" w:line="240"/>
+              <w:ind w:left="100" w:right="100" w:firstLine="0" w:firstLineChars="0"/>
+              <w:rPr>
+                <w:rFonts w:ascii="Times New Roman" w:hAnsi="Times New Roman" w:eastAsia="Times New Roman" w:cs="Times New Roman"/>
+                <w:i w:val="false"/>
+                <w:b w:val="false"/>
+                <w:u w:val="none"/>
+                <w:strike w:val="false"/>
+                <w:sz w:val="18"/>
+                <w:szCs w:val="18"/>
+                <w:color w:val="000000"/>
+              </w:rPr>
+            </w:pPr>
+            <w:r>
+              <w:rPr>
+                <w:rFonts w:ascii="Times New Roman" w:hAnsi="Times New Roman" w:eastAsia="Times New Roman" w:cs="Times New Roman"/>
+                <w:i w:val="false"/>
+                <w:b w:val="false"/>
+                <w:u w:val="none"/>
+                <w:strike w:val="false"/>
+                <w:sz w:val="18"/>
+                <w:szCs w:val="18"/>
+                <w:color w:val="000000"/>
+              </w:rPr>
+              <w:t xml:space="preserve">14 (8.1%)</w:t>
+            </w:r>
+          </w:p>
+        </w:tc>
+        <w:tc>
+          <w:tcPr>
+            <w:tcBorders>
+              <w:bottom w:val="none" w:sz="0" w:space="0" w:color="000000"/>
+              <w:top w:val="none" w:sz="0" w:space="0" w:color="000000"/>
+              <w:left w:val="none" w:sz="0" w:space="0" w:color="000000"/>
+              <w:right w:val="none" w:sz="0" w:space="0" w:color="000000"/>
+            </w:tcBorders>
+            <w:shd w:val="clear" w:color="auto" w:fill="FFFFFF"/>
+            <w:tcMar>
+              <w:top w:w="0" w:type="dxa"/>
+              <w:bottom w:w="0" w:type="dxa"/>
+              <w:left w:w="0" w:type="dxa"/>
+              <w:right w:w="0" w:type="dxa"/>
+            </w:tcMar>
+            <w:vAlign w:val="top"/>
+          </w:tcPr>
+          <w:p>
+            <w:pPr>
+              <w:pStyle w:val="Normal"/>
+              <w:jc w:val="center"/>
+              <w:pBdr>
+                <w:bottom w:val="none" w:sz="0" w:space="0" w:color="000000"/>
+                <w:top w:val="none" w:sz="0" w:space="0" w:color="000000"/>
+                <w:left w:val="none" w:sz="0" w:space="0" w:color="000000"/>
+                <w:right w:val="none" w:sz="0" w:space="0" w:color="000000"/>
+              </w:pBdr>
+              <w:spacing w:after="100" w:before="100" w:line="240"/>
+              <w:ind w:left="100" w:right="100" w:firstLine="0" w:firstLineChars="0"/>
+              <w:rPr>
+                <w:rFonts w:ascii="Times New Roman" w:hAnsi="Times New Roman" w:eastAsia="Times New Roman" w:cs="Times New Roman"/>
+                <w:i w:val="false"/>
+                <w:b w:val="false"/>
+                <w:u w:val="none"/>
+                <w:strike w:val="false"/>
+                <w:sz w:val="18"/>
+                <w:szCs w:val="18"/>
+                <w:color w:val="000000"/>
+              </w:rPr>
+            </w:pPr>
+            <w:r>
+              <w:rPr>
+                <w:rFonts w:ascii="Times New Roman" w:hAnsi="Times New Roman" w:eastAsia="Times New Roman" w:cs="Times New Roman"/>
+                <w:i w:val="false"/>
+                <w:b w:val="false"/>
+                <w:u w:val="none"/>
+                <w:strike w:val="false"/>
+                <w:sz w:val="18"/>
+                <w:szCs w:val="18"/>
+                <w:color w:val="000000"/>
+              </w:rPr>
+              <w:t xml:space="preserve">7 (4.1%)</w:t>
             </w:r>
           </w:p>
         </w:tc>
@@ -13603,286 +13603,6 @@
                 <w:szCs w:val="18"/>
                 <w:color w:val="000000"/>
               </w:rPr>
-              <w:t xml:space="preserve">RX</w:t>
-            </w:r>
-          </w:p>
-        </w:tc>
-        <w:tc>
-          <w:tcPr>
-            <w:tcBorders>
-              <w:bottom w:val="none" w:sz="0" w:space="0" w:color="000000"/>
-              <w:top w:val="none" w:sz="0" w:space="0" w:color="000000"/>
-              <w:left w:val="none" w:sz="0" w:space="0" w:color="000000"/>
-              <w:right w:val="none" w:sz="0" w:space="0" w:color="000000"/>
-            </w:tcBorders>
-            <w:shd w:val="clear" w:color="auto" w:fill="FFFFFF"/>
-            <w:tcMar>
-              <w:top w:w="0" w:type="dxa"/>
-              <w:bottom w:w="0" w:type="dxa"/>
-              <w:left w:w="0" w:type="dxa"/>
-              <w:right w:w="0" w:type="dxa"/>
-            </w:tcMar>
-            <w:vAlign w:val="top"/>
-          </w:tcPr>
-          <w:p>
-            <w:pPr>
-              <w:pStyle w:val="Normal"/>
-              <w:jc w:val="center"/>
-              <w:pBdr>
-                <w:bottom w:val="none" w:sz="0" w:space="0" w:color="000000"/>
-                <w:top w:val="none" w:sz="0" w:space="0" w:color="000000"/>
-                <w:left w:val="none" w:sz="0" w:space="0" w:color="000000"/>
-                <w:right w:val="none" w:sz="0" w:space="0" w:color="000000"/>
-              </w:pBdr>
-              <w:spacing w:after="100" w:before="100" w:line="240"/>
-              <w:ind w:left="100" w:right="100" w:firstLine="0" w:firstLineChars="0"/>
-              <w:rPr>
-                <w:rFonts w:ascii="Times New Roman" w:hAnsi="Times New Roman" w:eastAsia="Times New Roman" w:cs="Times New Roman"/>
-                <w:i w:val="false"/>
-                <w:b w:val="false"/>
-                <w:u w:val="none"/>
-                <w:strike w:val="false"/>
-                <w:sz w:val="18"/>
-                <w:szCs w:val="18"/>
-                <w:color w:val="000000"/>
-              </w:rPr>
-            </w:pPr>
-            <w:r>
-              <w:rPr>
-                <w:rFonts w:ascii="Times New Roman" w:hAnsi="Times New Roman" w:eastAsia="Times New Roman" w:cs="Times New Roman"/>
-                <w:i w:val="false"/>
-                <w:b w:val="false"/>
-                <w:u w:val="none"/>
-                <w:strike w:val="false"/>
-                <w:sz w:val="18"/>
-                <w:szCs w:val="18"/>
-                <w:color w:val="000000"/>
-              </w:rPr>
-              <w:t xml:space="preserve">23 (6.3%)</w:t>
-            </w:r>
-          </w:p>
-        </w:tc>
-        <w:tc>
-          <w:tcPr>
-            <w:tcBorders>
-              <w:bottom w:val="none" w:sz="0" w:space="0" w:color="000000"/>
-              <w:top w:val="none" w:sz="0" w:space="0" w:color="000000"/>
-              <w:left w:val="none" w:sz="0" w:space="0" w:color="000000"/>
-              <w:right w:val="none" w:sz="0" w:space="0" w:color="000000"/>
-            </w:tcBorders>
-            <w:shd w:val="clear" w:color="auto" w:fill="FFFFFF"/>
-            <w:tcMar>
-              <w:top w:w="0" w:type="dxa"/>
-              <w:bottom w:w="0" w:type="dxa"/>
-              <w:left w:w="0" w:type="dxa"/>
-              <w:right w:w="0" w:type="dxa"/>
-            </w:tcMar>
-            <w:vAlign w:val="top"/>
-          </w:tcPr>
-          <w:p>
-            <w:pPr>
-              <w:pStyle w:val="Normal"/>
-              <w:jc w:val="center"/>
-              <w:pBdr>
-                <w:bottom w:val="none" w:sz="0" w:space="0" w:color="000000"/>
-                <w:top w:val="none" w:sz="0" w:space="0" w:color="000000"/>
-                <w:left w:val="none" w:sz="0" w:space="0" w:color="000000"/>
-                <w:right w:val="none" w:sz="0" w:space="0" w:color="000000"/>
-              </w:pBdr>
-              <w:spacing w:after="100" w:before="100" w:line="240"/>
-              <w:ind w:left="100" w:right="100" w:firstLine="0" w:firstLineChars="0"/>
-              <w:rPr>
-                <w:rFonts w:ascii="Times New Roman" w:hAnsi="Times New Roman" w:eastAsia="Times New Roman" w:cs="Times New Roman"/>
-                <w:i w:val="false"/>
-                <w:b w:val="false"/>
-                <w:u w:val="none"/>
-                <w:strike w:val="false"/>
-                <w:sz w:val="18"/>
-                <w:szCs w:val="18"/>
-                <w:color w:val="000000"/>
-              </w:rPr>
-            </w:pPr>
-            <w:r>
-              <w:rPr>
-                <w:rFonts w:ascii="Times New Roman" w:hAnsi="Times New Roman" w:eastAsia="Times New Roman" w:cs="Times New Roman"/>
-                <w:i w:val="false"/>
-                <w:b w:val="false"/>
-                <w:u w:val="none"/>
-                <w:strike w:val="false"/>
-                <w:sz w:val="18"/>
-                <w:szCs w:val="18"/>
-                <w:color w:val="000000"/>
-              </w:rPr>
-              <w:t xml:space="preserve">10 (5.5%)</w:t>
-            </w:r>
-          </w:p>
-        </w:tc>
-        <w:tc>
-          <w:tcPr>
-            <w:tcBorders>
-              <w:bottom w:val="none" w:sz="0" w:space="0" w:color="000000"/>
-              <w:top w:val="none" w:sz="0" w:space="0" w:color="000000"/>
-              <w:left w:val="none" w:sz="0" w:space="0" w:color="000000"/>
-              <w:right w:val="none" w:sz="0" w:space="0" w:color="000000"/>
-            </w:tcBorders>
-            <w:shd w:val="clear" w:color="auto" w:fill="FFFFFF"/>
-            <w:tcMar>
-              <w:top w:w="0" w:type="dxa"/>
-              <w:bottom w:w="0" w:type="dxa"/>
-              <w:left w:w="0" w:type="dxa"/>
-              <w:right w:w="0" w:type="dxa"/>
-            </w:tcMar>
-            <w:vAlign w:val="top"/>
-          </w:tcPr>
-          <w:p>
-            <w:pPr>
-              <w:pStyle w:val="Normal"/>
-              <w:jc w:val="center"/>
-              <w:pBdr>
-                <w:bottom w:val="none" w:sz="0" w:space="0" w:color="000000"/>
-                <w:top w:val="none" w:sz="0" w:space="0" w:color="000000"/>
-                <w:left w:val="none" w:sz="0" w:space="0" w:color="000000"/>
-                <w:right w:val="none" w:sz="0" w:space="0" w:color="000000"/>
-              </w:pBdr>
-              <w:spacing w:after="100" w:before="100" w:line="240"/>
-              <w:ind w:left="100" w:right="100" w:firstLine="0" w:firstLineChars="0"/>
-              <w:rPr>
-                <w:rFonts w:ascii="Times New Roman" w:hAnsi="Times New Roman" w:eastAsia="Times New Roman" w:cs="Times New Roman"/>
-                <w:i w:val="false"/>
-                <w:b w:val="false"/>
-                <w:u w:val="none"/>
-                <w:strike w:val="false"/>
-                <w:sz w:val="18"/>
-                <w:szCs w:val="18"/>
-                <w:color w:val="000000"/>
-              </w:rPr>
-            </w:pPr>
-            <w:r>
-              <w:rPr>
-                <w:rFonts w:ascii="Times New Roman" w:hAnsi="Times New Roman" w:eastAsia="Times New Roman" w:cs="Times New Roman"/>
-                <w:i w:val="false"/>
-                <w:b w:val="false"/>
-                <w:u w:val="none"/>
-                <w:strike w:val="false"/>
-                <w:sz w:val="18"/>
-                <w:szCs w:val="18"/>
-                <w:color w:val="000000"/>
-              </w:rPr>
-              <w:t xml:space="preserve">13 (7.1%)</w:t>
-            </w:r>
-          </w:p>
-        </w:tc>
-        <w:tc>
-          <w:tcPr>
-            <w:tcBorders>
-              <w:bottom w:val="none" w:sz="0" w:space="0" w:color="000000"/>
-              <w:top w:val="none" w:sz="0" w:space="0" w:color="000000"/>
-              <w:left w:val="none" w:sz="0" w:space="0" w:color="000000"/>
-              <w:right w:val="none" w:sz="0" w:space="0" w:color="000000"/>
-            </w:tcBorders>
-            <w:shd w:val="clear" w:color="auto" w:fill="FFFFFF"/>
-            <w:tcMar>
-              <w:top w:w="0" w:type="dxa"/>
-              <w:bottom w:w="0" w:type="dxa"/>
-              <w:left w:w="0" w:type="dxa"/>
-              <w:right w:w="0" w:type="dxa"/>
-            </w:tcMar>
-            <w:vAlign w:val="top"/>
-          </w:tcPr>
-          <w:p>
-            <w:pPr>
-              <w:pStyle w:val="Normal"/>
-              <w:jc w:val="center"/>
-              <w:pBdr>
-                <w:bottom w:val="none" w:sz="0" w:space="0" w:color="000000"/>
-                <w:top w:val="none" w:sz="0" w:space="0" w:color="000000"/>
-                <w:left w:val="none" w:sz="0" w:space="0" w:color="000000"/>
-                <w:right w:val="none" w:sz="0" w:space="0" w:color="000000"/>
-              </w:pBdr>
-              <w:spacing w:after="100" w:before="100" w:line="240"/>
-              <w:ind w:left="100" w:right="100" w:firstLine="0" w:firstLineChars="0"/>
-              <w:rPr>
-                <w:rFonts w:ascii="Times New Roman" w:hAnsi="Times New Roman" w:eastAsia="Times New Roman" w:cs="Times New Roman"/>
-                <w:i w:val="false"/>
-                <w:b w:val="false"/>
-                <w:u w:val="none"/>
-                <w:strike w:val="false"/>
-                <w:sz w:val="18"/>
-                <w:szCs w:val="18"/>
-                <w:color w:val="000000"/>
-              </w:rPr>
-            </w:pPr>
-            <w:r>
-              <w:rPr>
-                <w:rFonts w:ascii="Times New Roman" w:hAnsi="Times New Roman" w:eastAsia="Times New Roman" w:cs="Times New Roman"/>
-                <w:i w:val="false"/>
-                <w:b w:val="false"/>
-                <w:u w:val="none"/>
-                <w:strike w:val="false"/>
-                <w:sz w:val="18"/>
-                <w:szCs w:val="18"/>
-                <w:color w:val="000000"/>
-              </w:rPr>
-              <w:t xml:space="preserve"/>
-            </w:r>
-          </w:p>
-        </w:tc>
-      </w:tr>
-      <w:tr>
-        <w:trPr>
-          <w:trHeight w:val="560" w:hRule="auto"/>
-        </w:trPr>
-        <w:tc>
-          <w:tcPr>
-            <w:tcBorders>
-              <w:bottom w:val="none" w:sz="0" w:space="0" w:color="000000"/>
-              <w:top w:val="none" w:sz="0" w:space="0" w:color="000000"/>
-              <w:left w:val="none" w:sz="0" w:space="0" w:color="000000"/>
-              <w:right w:val="none" w:sz="0" w:space="0" w:color="000000"/>
-            </w:tcBorders>
-            <w:shd w:val="clear" w:color="auto" w:fill="FFFFFF"/>
-            <w:tcMar>
-              <w:top w:w="0" w:type="dxa"/>
-              <w:bottom w:w="0" w:type="dxa"/>
-              <w:left w:w="0" w:type="dxa"/>
-              <w:right w:w="0" w:type="dxa"/>
-            </w:tcMar>
-            <w:vAlign w:val="top"/>
-          </w:tcPr>
-          <w:p>
-            <w:pPr>
-              <w:pStyle w:val="Normal"/>
-              <w:jc w:val="left"/>
-              <w:pBdr>
-                <w:bottom w:val="none" w:sz="0" w:space="0" w:color="000000"/>
-                <w:top w:val="none" w:sz="0" w:space="0" w:color="000000"/>
-                <w:left w:val="none" w:sz="0" w:space="0" w:color="000000"/>
-                <w:right w:val="none" w:sz="0" w:space="0" w:color="000000"/>
-              </w:pBdr>
-              <w:spacing w:after="100" w:before="100" w:line="240"/>
-              <w:ind w:left="300" w:right="100" w:firstLine="0" w:firstLineChars="0"/>
-              <w:rPr>
-                <w:rFonts w:ascii="Times New Roman" w:hAnsi="Times New Roman" w:eastAsia="Times New Roman" w:cs="Times New Roman"/>
-                <w:i w:val="false"/>
-                <w:b w:val="false"/>
-                <w:u w:val="none"/>
-                <w:strike w:val="false"/>
-                <w:sz w:val="18"/>
-                <w:szCs w:val="18"/>
-                <w:color w:val="000000"/>
-              </w:rPr>
-            </w:pPr>
-            <w:r>
-              <w:rPr>
-                <w:rFonts w:ascii="Times New Roman" w:hAnsi="Times New Roman" w:eastAsia="Times New Roman" w:cs="Times New Roman"/>
-                <w:i w:val="false"/>
-                <w:b w:val="false"/>
-                <w:u w:val="none"/>
-                <w:strike w:val="false"/>
-                <w:sz w:val="18"/>
-                <w:szCs w:val="18"/>
-                <w:color w:val="000000"/>
-              </w:rPr>
               <w:t xml:space="preserve">Missing</w:t>
             </w:r>
           </w:p>
@@ -13938,117 +13658,117 @@
                 <w:szCs w:val="18"/>
                 <w:color w:val="000000"/>
               </w:rPr>
-              <w:t xml:space="preserve">73</w:t>
-            </w:r>
-          </w:p>
-        </w:tc>
-        <w:tc>
-          <w:tcPr>
-            <w:tcBorders>
-              <w:bottom w:val="none" w:sz="0" w:space="0" w:color="000000"/>
-              <w:top w:val="none" w:sz="0" w:space="0" w:color="000000"/>
-              <w:left w:val="none" w:sz="0" w:space="0" w:color="000000"/>
-              <w:right w:val="none" w:sz="0" w:space="0" w:color="000000"/>
-            </w:tcBorders>
-            <w:shd w:val="clear" w:color="auto" w:fill="FFFFFF"/>
-            <w:tcMar>
-              <w:top w:w="0" w:type="dxa"/>
-              <w:bottom w:w="0" w:type="dxa"/>
-              <w:left w:w="0" w:type="dxa"/>
-              <w:right w:w="0" w:type="dxa"/>
-            </w:tcMar>
-            <w:vAlign w:val="top"/>
-          </w:tcPr>
-          <w:p>
-            <w:pPr>
-              <w:pStyle w:val="Normal"/>
-              <w:jc w:val="center"/>
-              <w:pBdr>
-                <w:bottom w:val="none" w:sz="0" w:space="0" w:color="000000"/>
-                <w:top w:val="none" w:sz="0" w:space="0" w:color="000000"/>
-                <w:left w:val="none" w:sz="0" w:space="0" w:color="000000"/>
-                <w:right w:val="none" w:sz="0" w:space="0" w:color="000000"/>
-              </w:pBdr>
-              <w:spacing w:after="100" w:before="100" w:line="240"/>
-              <w:ind w:left="100" w:right="100" w:firstLine="0" w:firstLineChars="0"/>
-              <w:rPr>
-                <w:rFonts w:ascii="Times New Roman" w:hAnsi="Times New Roman" w:eastAsia="Times New Roman" w:cs="Times New Roman"/>
-                <w:i w:val="false"/>
-                <w:b w:val="false"/>
-                <w:u w:val="none"/>
-                <w:strike w:val="false"/>
-                <w:sz w:val="18"/>
-                <w:szCs w:val="18"/>
-                <w:color w:val="000000"/>
-              </w:rPr>
-            </w:pPr>
-            <w:r>
-              <w:rPr>
-                <w:rFonts w:ascii="Times New Roman" w:hAnsi="Times New Roman" w:eastAsia="Times New Roman" w:cs="Times New Roman"/>
-                <w:i w:val="false"/>
-                <w:b w:val="false"/>
-                <w:u w:val="none"/>
-                <w:strike w:val="false"/>
-                <w:sz w:val="18"/>
-                <w:szCs w:val="18"/>
-                <w:color w:val="000000"/>
-              </w:rPr>
-              <w:t xml:space="preserve">36</w:t>
-            </w:r>
-          </w:p>
-        </w:tc>
-        <w:tc>
-          <w:tcPr>
-            <w:tcBorders>
-              <w:bottom w:val="none" w:sz="0" w:space="0" w:color="000000"/>
-              <w:top w:val="none" w:sz="0" w:space="0" w:color="000000"/>
-              <w:left w:val="none" w:sz="0" w:space="0" w:color="000000"/>
-              <w:right w:val="none" w:sz="0" w:space="0" w:color="000000"/>
-            </w:tcBorders>
-            <w:shd w:val="clear" w:color="auto" w:fill="FFFFFF"/>
-            <w:tcMar>
-              <w:top w:w="0" w:type="dxa"/>
-              <w:bottom w:w="0" w:type="dxa"/>
-              <w:left w:w="0" w:type="dxa"/>
-              <w:right w:w="0" w:type="dxa"/>
-            </w:tcMar>
-            <w:vAlign w:val="top"/>
-          </w:tcPr>
-          <w:p>
-            <w:pPr>
-              <w:pStyle w:val="Normal"/>
-              <w:jc w:val="center"/>
-              <w:pBdr>
-                <w:bottom w:val="none" w:sz="0" w:space="0" w:color="000000"/>
-                <w:top w:val="none" w:sz="0" w:space="0" w:color="000000"/>
-                <w:left w:val="none" w:sz="0" w:space="0" w:color="000000"/>
-                <w:right w:val="none" w:sz="0" w:space="0" w:color="000000"/>
-              </w:pBdr>
-              <w:spacing w:after="100" w:before="100" w:line="240"/>
-              <w:ind w:left="100" w:right="100" w:firstLine="0" w:firstLineChars="0"/>
-              <w:rPr>
-                <w:rFonts w:ascii="Times New Roman" w:hAnsi="Times New Roman" w:eastAsia="Times New Roman" w:cs="Times New Roman"/>
-                <w:i w:val="false"/>
-                <w:b w:val="false"/>
-                <w:u w:val="none"/>
-                <w:strike w:val="false"/>
-                <w:sz w:val="18"/>
-                <w:szCs w:val="18"/>
-                <w:color w:val="000000"/>
-              </w:rPr>
-            </w:pPr>
-            <w:r>
-              <w:rPr>
-                <w:rFonts w:ascii="Times New Roman" w:hAnsi="Times New Roman" w:eastAsia="Times New Roman" w:cs="Times New Roman"/>
-                <w:i w:val="false"/>
-                <w:b w:val="false"/>
-                <w:u w:val="none"/>
-                <w:strike w:val="false"/>
-                <w:sz w:val="18"/>
-                <w:szCs w:val="18"/>
-                <w:color w:val="000000"/>
-              </w:rPr>
-              <w:t xml:space="preserve">37</w:t>
+              <w:t xml:space="preserve">96</w:t>
+            </w:r>
+          </w:p>
+        </w:tc>
+        <w:tc>
+          <w:tcPr>
+            <w:tcBorders>
+              <w:bottom w:val="none" w:sz="0" w:space="0" w:color="000000"/>
+              <w:top w:val="none" w:sz="0" w:space="0" w:color="000000"/>
+              <w:left w:val="none" w:sz="0" w:space="0" w:color="000000"/>
+              <w:right w:val="none" w:sz="0" w:space="0" w:color="000000"/>
+            </w:tcBorders>
+            <w:shd w:val="clear" w:color="auto" w:fill="FFFFFF"/>
+            <w:tcMar>
+              <w:top w:w="0" w:type="dxa"/>
+              <w:bottom w:w="0" w:type="dxa"/>
+              <w:left w:w="0" w:type="dxa"/>
+              <w:right w:w="0" w:type="dxa"/>
+            </w:tcMar>
+            <w:vAlign w:val="top"/>
+          </w:tcPr>
+          <w:p>
+            <w:pPr>
+              <w:pStyle w:val="Normal"/>
+              <w:jc w:val="center"/>
+              <w:pBdr>
+                <w:bottom w:val="none" w:sz="0" w:space="0" w:color="000000"/>
+                <w:top w:val="none" w:sz="0" w:space="0" w:color="000000"/>
+                <w:left w:val="none" w:sz="0" w:space="0" w:color="000000"/>
+                <w:right w:val="none" w:sz="0" w:space="0" w:color="000000"/>
+              </w:pBdr>
+              <w:spacing w:after="100" w:before="100" w:line="240"/>
+              <w:ind w:left="100" w:right="100" w:firstLine="0" w:firstLineChars="0"/>
+              <w:rPr>
+                <w:rFonts w:ascii="Times New Roman" w:hAnsi="Times New Roman" w:eastAsia="Times New Roman" w:cs="Times New Roman"/>
+                <w:i w:val="false"/>
+                <w:b w:val="false"/>
+                <w:u w:val="none"/>
+                <w:strike w:val="false"/>
+                <w:sz w:val="18"/>
+                <w:szCs w:val="18"/>
+                <w:color w:val="000000"/>
+              </w:rPr>
+            </w:pPr>
+            <w:r>
+              <w:rPr>
+                <w:rFonts w:ascii="Times New Roman" w:hAnsi="Times New Roman" w:eastAsia="Times New Roman" w:cs="Times New Roman"/>
+                <w:i w:val="false"/>
+                <w:b w:val="false"/>
+                <w:u w:val="none"/>
+                <w:strike w:val="false"/>
+                <w:sz w:val="18"/>
+                <w:szCs w:val="18"/>
+                <w:color w:val="000000"/>
+              </w:rPr>
+              <w:t xml:space="preserve">46</w:t>
+            </w:r>
+          </w:p>
+        </w:tc>
+        <w:tc>
+          <w:tcPr>
+            <w:tcBorders>
+              <w:bottom w:val="none" w:sz="0" w:space="0" w:color="000000"/>
+              <w:top w:val="none" w:sz="0" w:space="0" w:color="000000"/>
+              <w:left w:val="none" w:sz="0" w:space="0" w:color="000000"/>
+              <w:right w:val="none" w:sz="0" w:space="0" w:color="000000"/>
+            </w:tcBorders>
+            <w:shd w:val="clear" w:color="auto" w:fill="FFFFFF"/>
+            <w:tcMar>
+              <w:top w:w="0" w:type="dxa"/>
+              <w:bottom w:w="0" w:type="dxa"/>
+              <w:left w:w="0" w:type="dxa"/>
+              <w:right w:w="0" w:type="dxa"/>
+            </w:tcMar>
+            <w:vAlign w:val="top"/>
+          </w:tcPr>
+          <w:p>
+            <w:pPr>
+              <w:pStyle w:val="Normal"/>
+              <w:jc w:val="center"/>
+              <w:pBdr>
+                <w:bottom w:val="none" w:sz="0" w:space="0" w:color="000000"/>
+                <w:top w:val="none" w:sz="0" w:space="0" w:color="000000"/>
+                <w:left w:val="none" w:sz="0" w:space="0" w:color="000000"/>
+                <w:right w:val="none" w:sz="0" w:space="0" w:color="000000"/>
+              </w:pBdr>
+              <w:spacing w:after="100" w:before="100" w:line="240"/>
+              <w:ind w:left="100" w:right="100" w:firstLine="0" w:firstLineChars="0"/>
+              <w:rPr>
+                <w:rFonts w:ascii="Times New Roman" w:hAnsi="Times New Roman" w:eastAsia="Times New Roman" w:cs="Times New Roman"/>
+                <w:i w:val="false"/>
+                <w:b w:val="false"/>
+                <w:u w:val="none"/>
+                <w:strike w:val="false"/>
+                <w:sz w:val="18"/>
+                <w:szCs w:val="18"/>
+                <w:color w:val="000000"/>
+              </w:rPr>
+            </w:pPr>
+            <w:r>
+              <w:rPr>
+                <w:rFonts w:ascii="Times New Roman" w:hAnsi="Times New Roman" w:eastAsia="Times New Roman" w:cs="Times New Roman"/>
+                <w:i w:val="false"/>
+                <w:b w:val="false"/>
+                <w:u w:val="none"/>
+                <w:strike w:val="false"/>
+                <w:sz w:val="18"/>
+                <w:szCs w:val="18"/>
+                <w:color w:val="000000"/>
+              </w:rPr>
+              <w:t xml:space="preserve">50</w:t>
             </w:r>
           </w:p>
         </w:tc>

</xml_diff>